<commit_message>
Integrate no-fly constraints through racetrack and route planning
</commit_message>
<xml_diff>
--- a/Build_Instructions.docx
+++ b/Build_Instructions.docx
@@ -1,6 +1,6 @@
 
 <file path=word/document.xml><?xml version="1.0" encoding="utf-8"?>
-<w:document xmlns:wpc="http://schemas.microsoft.com/office/word/2010/wordprocessingCanvas" xmlns:mo="http://schemas.microsoft.com/office/mac/office/2008/main" xmlns:mc="http://schemas.openxmlformats.org/markup-compatibility/2006" xmlns:mv="urn:schemas-microsoft-com:mac:vml" xmlns:o="urn:schemas-microsoft-com:office:office" xmlns:r="http://schemas.openxmlformats.org/officeDocument/2006/relationships" xmlns:m="http://schemas.openxmlformats.org/officeDocument/2006/math" xmlns:v="urn:schemas-microsoft-com:vml" xmlns:wp14="http://schemas.microsoft.com/office/word/2010/wordprocessingDrawing" xmlns:wp="http://schemas.openxmlformats.org/drawingml/2006/wordprocessingDrawing" xmlns:w10="urn:schemas-microsoft-com:office:word" xmlns:w="http://schemas.openxmlformats.org/wordprocessingml/2006/main" xmlns:w14="http://schemas.microsoft.com/office/word/2010/wordml" xmlns:wpg="http://schemas.microsoft.com/office/word/2010/wordprocessingGroup" xmlns:wpi="http://schemas.microsoft.com/office/word/2010/wordprocessingInk" xmlns:wne="http://schemas.microsoft.com/office/word/2006/wordml" xmlns:wps="http://schemas.microsoft.com/office/word/2010/wordprocessingShape" mc:Ignorable="w14 wp14">
+<w:document xmlns:ns1="http://schemas.openxmlformats.org/markup-compatibility/2006" xmlns:w="http://schemas.openxmlformats.org/wordprocessingml/2006/main" ns1:Ignorable="w14 wp14">
   <w:body>
     <w:p>
       <w:pPr>
@@ -941,6 +941,208 @@
         <w:t>原因: 这条命令把生成器、C 编译器和 C++ 编译器都明确写出来了，可以避免 CMake 在 Windows 下自动猜错工具链。</w:t>
       </w:r>
     </w:p>
+    <w:p>
+      <w:r>
+        <w:t>7. 2026-03-19 集成更新（代码与输入对齐）</w:t>
+      </w:r>
+    </w:p>
+    <w:p>
+      <w:r>
+        <w:t>航向角统一：在 PathPlanningStage 中已将导航航向（0°=北，顺时针）统一转换为 route_planner 使用的数学航向（0°=东，逆时针）。</w:t>
+      </w:r>
+    </w:p>
+    <w:p>
+      <w:r>
+        <w:t>坐标系统一：经纬度到平面坐标统一使用 WebMercator 半径 R=6378137。</w:t>
+      </w:r>
+    </w:p>
+    <w:p>
+      <w:r>
+        <w:t>障碍输入已打通：PathPlanningStage 现在会读取 mission.operation_area.no_fly_zones 并传入 route_planner。</w:t>
+      </w:r>
+    </w:p>
+    <w:p>
+      <w:r>
+        <w:t>兼容性增强：即使 no_fly_zones 未显式写 is_defined=true，只要提供了 vertices/zones 也会被识别并生效。</w:t>
+      </w:r>
+    </w:p>
+    <w:p/>
+    <w:p>
+      <w:r>
+        <w:t>8. Windows 终端测试流程（PowerShell / CMD）</w:t>
+      </w:r>
+    </w:p>
+    <w:p>
+      <w:r>
+        <w:t>推荐优先使用 PowerShell。以下步骤用于验证：编译通过、回归测试通过、障碍输入对航路有实际影响。</w:t>
+      </w:r>
+    </w:p>
+    <w:p/>
+    <w:p>
+      <w:r>
+        <w:t>8.1 PowerShell：编译与测试（MinGW）</w:t>
+      </w:r>
+    </w:p>
+    <w:p>
+      <w:r>
+        <w:t>$proj = "C:\Users\24333\Desktop\university\azxm\flight-refuel\260306\flight_refuel_branch_update_v3\flight_refuel"</w:t>
+      </w:r>
+    </w:p>
+    <w:p>
+      <w:r>
+        <w:t>Set-Location $proj</w:t>
+      </w:r>
+    </w:p>
+    <w:p>
+      <w:r>
+        <w:t>cmake -S . -B build_win -G "MinGW Makefiles" -DCMAKE_C_COMPILER=gcc -DCMAKE_CXX_COMPILER=g++</w:t>
+      </w:r>
+    </w:p>
+    <w:p>
+      <w:r>
+        <w:t>cmake --build build_win -j 4</w:t>
+      </w:r>
+    </w:p>
+    <w:p>
+      <w:r>
+        <w:t>ctest --test-dir build_win --output-on-failure</w:t>
+      </w:r>
+    </w:p>
+    <w:p/>
+    <w:p>
+      <w:r>
+        <w:t>8.2 PowerShell：编译与测试（Visual Studio 2022）</w:t>
+      </w:r>
+    </w:p>
+    <w:p>
+      <w:r>
+        <w:t>$proj = "C:\Users\24333\Desktop\university\azxm\flight-refuel\260306\flight_refuel_branch_update_v3\flight_refuel"</w:t>
+      </w:r>
+    </w:p>
+    <w:p>
+      <w:r>
+        <w:t>Set-Location $proj</w:t>
+      </w:r>
+    </w:p>
+    <w:p>
+      <w:r>
+        <w:t>cmake -S . -B build_vs -G "Visual Studio 17 2022" -A x64</w:t>
+      </w:r>
+    </w:p>
+    <w:p>
+      <w:r>
+        <w:t>cmake --build build_vs --config Release</w:t>
+      </w:r>
+    </w:p>
+    <w:p>
+      <w:r>
+        <w:t>ctest --test-dir build_vs -C Release --output-on-failure</w:t>
+      </w:r>
+    </w:p>
+    <w:p/>
+    <w:p>
+      <w:r>
+        <w:t>8.3 先跑一次基线样例</w:t>
+      </w:r>
+    </w:p>
+    <w:p>
+      <w:r>
+        <w:t>MinGW: .\build_win\refuel_demo.exe .\demo\input\0210 C:\temp\out_base</w:t>
+      </w:r>
+    </w:p>
+    <w:p>
+      <w:r>
+        <w:t xml:space="preserve">VS:    .\build_vs\Release\refuel_demo.exe .\demo\input\0210 C:\temp\out_base</w:t>
+      </w:r>
+    </w:p>
+    <w:p/>
+    <w:p>
+      <w:r>
+        <w:t>8.4 障碍输入 A/B 对照（验证 no-fly 生效）</w:t>
+      </w:r>
+    </w:p>
+    <w:p>
+      <w:r>
+        <w:t>A 组：关闭 no-fly；B 组：在 mission1.json 中设置明显拦路的 no-fly 多边形。</w:t>
+      </w:r>
+    </w:p>
+    <w:p>
+      <w:r>
+        <w:t>分别运行：</w:t>
+      </w:r>
+    </w:p>
+    <w:p>
+      <w:r>
+        <w:t>MinGW: .\build_win\refuel_demo.exe C:\temp\in_noobs C:\temp\out_noobs</w:t>
+      </w:r>
+    </w:p>
+    <w:p>
+      <w:r>
+        <w:t xml:space="preserve">MinGW: .\build_win\refuel_demo.exe C:\temp\in_obs   C:\temp\out_obs</w:t>
+      </w:r>
+    </w:p>
+    <w:p>
+      <w:r>
+        <w:t xml:space="preserve">VS:    .\build_vs\Release\refuel_demo.exe C:\temp\in_noobs C:\temp\out_noobs</w:t>
+      </w:r>
+    </w:p>
+    <w:p>
+      <w:r>
+        <w:t xml:space="preserve">VS:    .\build_vs\Release\refuel_demo.exe C:\temp\in_obs   C:\temp\out_obs</w:t>
+      </w:r>
+    </w:p>
+    <w:p/>
+    <w:p>
+      <w:r>
+        <w:t>8.5 结果判定（建议）</w:t>
+      </w:r>
+    </w:p>
+    <w:p>
+      <w:r>
+        <w:t>对比 out_noobs 与 out_obs 的 tanker01.csv：</w:t>
+      </w:r>
+    </w:p>
+    <w:p>
+      <w:r>
+        <w:t>1) 文件哈希应不同（same_file=False）</w:t>
+      </w:r>
+    </w:p>
+    <w:p>
+      <w:r>
+        <w:t>2) 路径长度应有差异（delta != 0）</w:t>
+      </w:r>
+    </w:p>
+    <w:p>
+      <w:r>
+        <w:t>若两者完全一致，通常表示障碍输入未正确传入或障碍位置未影响当前航线。</w:t>
+      </w:r>
+    </w:p>
+    <w:p/>
+    <w:p>
+      <w:r>
+        <w:t>8.6 CMD 快速构建（MinGW）</w:t>
+      </w:r>
+    </w:p>
+    <w:p>
+      <w:r>
+        <w:t>cd /d C:\Users\24333\Desktop\university\azxm\flight-refuel\260306\flight_refuel_branch_update_v3\flight_refuel</w:t>
+      </w:r>
+    </w:p>
+    <w:p>
+      <w:r>
+        <w:t>cmake -S . -B build_win -G "MinGW Makefiles" -DCMAKE_C_COMPILER=gcc -DCMAKE_CXX_COMPILER=g++</w:t>
+      </w:r>
+    </w:p>
+    <w:p>
+      <w:r>
+        <w:t>cmake --build build_win -j 4</w:t>
+      </w:r>
+    </w:p>
+    <w:p>
+      <w:r>
+        <w:t>ctest --test-dir build_win --output-on-failure</w:t>
+      </w:r>
+    </w:p>
     <w:sectPr>
       <w:pgSz w:w="12240" w:h="15840"/>
       <w:pgMar w:top="1134" w:right="1247" w:bottom="1134" w:left="1247" w:header="720" w:footer="720" w:gutter="0"/>

</xml_diff>